<commit_message>
nc73: Note 20 theory revision — cross term 2C_bf, C5, identification, conditional monotonicity
- Lemma 1: explicit log1p leakage bound ((1-c)/c)^2 Var_p(1/x)
- new Lemma 1b: log-factor to probability displacement, p-weighted variance energies
- C2: alpha pinned as panel energy conversion factor E_b(top-200)/E_b(HK)
- new C5: Cov_p(beta,phi)=0 with Cauchy-Schwarz worst case 2sqrt(E_f/E_b)
- Prop 3: k_f estimand explicitly carries 2C_bf; omega = alpha + (E_f+2C_bf)/E_b + eps
- new Identification paragraph: A1 exclusion restriction + three measurements (k_n, split-half, k_f)
- Prop 4: three-layer rewrite (conditional quadratic monotonicity / local raw-JS strict increase / global saturation); dropped 'independently of alpha'
- Scope + HK-denominator (i) aligned; Supp Fig 2 legend notes C_bf = 0 by construction
- MS: monotonicity claim now 'under the stated conditions' (net-zero words)
- verified: build 226/226, MS 129, SI 120, CL+Guide 44, XV8 64 (MAIN 4992), pytest 29/29, fresh-DOCX 15/15
</commit_message>
<xml_diff>
--- a/CKI_Submission_NC/CKI_Supplementary_NC.docx
+++ b/CKI_Submission_NC/CKI_Supplementary_NC.docx
@@ -2659,7 +2659,7 @@
           <w:color w:val="000000"/>
           <w:sz w:val="22"/>
         </w:rPr>
-        <w:t>This note states precisely what ω estimates, under which conditions, and with what error, connecting the operational algorithm (Methods) to the interpretation used in the main text. We adopt a generative factor model for the log-expression of a population, log x = σ + β + φ, where σ is a global scale (sequencing depth, capture efficiency), β a background factor (technical variation plus neutral drift), and φ a functional factor that vanishes on genes whose regulation does not change. All statements are scoped to this model class and to the brain-order normalization p = softmax(log1p(c)); no claim is made outside them. Raw diagnostics: results/theory_diagnostics.csv (script notebooks/85_theory_diagnostics.py; Supplementary Fig. 2).</w:t>
+        <w:t>This note states precisely what ω estimates, under which conditions, and with what error, connecting the operational algorithm (Methods) to the interpretation used in the main text. We adopt a generative factor model for the log-expression of a population, log x = σ + β + φ, where σ is a global scale (sequencing depth, capture efficiency), β a background factor (technical variation plus neutral drift), and φ a functional factor that vanishes on genes whose regulation does not change. Because β and φ enter the observed vector only through their sum, separating them requires an explicit exclusion restriction; the identification argument is given after Proposition 3 below. All statements are scoped to this model class and to the brain-order normalization p = softmax(log1p(c)); no claim is made outside them. Raw diagnostics: results/theory_diagnostics.csv (script notebooks/85_theory_diagnostics.py; Supplementary Fig. 2).</w:t>
       </w:r>
     </w:p>
     <w:p>
@@ -2670,7 +2670,7 @@
           <w:color w:val="000000"/>
           <w:sz w:val="22"/>
         </w:rPr>
-        <w:t>Lemma 1 (exact cancellation of global scale). Under log-softmax normalization, multiplying all counts of a population by any positive constant leaves its probability vector unchanged: the additive log-space shift cancels between numerator and denominator, so σ contributes exactly nothing to k_n, k_f, or ω. The implemented log1p transform deviates from a pure logarithm by terms of order 1/x per gene, negligible at pseudobulk count scales; depth differences are removed by construction, not by approximation (consistent with the twofold-depth robustness scenario of Supplementary Note 1).</w:t>
+        <w:t>Lemma 1 (exact cancellation of global scale). Under log-softmax normalization, multiplying all counts of a population by any positive constant leaves its probability vector unchanged: the additive log-space shift cancels between numerator and denominator, so σ contributes exactly nothing to k_n, k_f, or ω. The implemented log1p transform deviates from a pure logarithm: log1p(cx) − log1p(x) = log c + (1/(cx) − 1/x) + O(1/x²), so rescaling leaks a gene-dependent field (1/c − 1)/x rather than an exact constant. The leak is explicitly bounded: for c ∈ [1/2, 2] its p-weighted energy is at most ((1 − c)/c)² Var_p(1/x), which is ≤ 10⁻⁴ ((1 − c)/c)² at pseudobulk count scales (detected genes have x ≥ 10²); depth differences are therefore removed up to a quantified O(1/x) leak, not merely asserted away (consistent with the twofold-depth scenario of Supplementary Note 1: c = 2, bound ≤ Var_p(1/x)/4).</w:t>
       </w:r>
     </w:p>
     <w:p>
@@ -2681,6 +2681,17 @@
           <w:color w:val="000000"/>
           <w:sz w:val="22"/>
         </w:rPr>
+        <w:t>Lemma 1b (from log-factors to probability displacements). For q = softmax(log x + g) relative to p = softmax(log x), a first-order expansion of the softmax gives δ_i = q_i − p_i = p_i(g_i − ḡ) + O(p_i||g||²), with ḡ = Σ_j p_j g_j the p-weighted mean; in particular Σ_i δ_i = 0 to first order, and the natural energy of a log-factor g on the simplex is the p-weighted variance Var_p(g) = Σ_i p_i (g_i − ḡ)², since Σ_i δ_i²/p_i = Var_p(g) + O(||g||³). We therefore define energies on a panel as E_b = Var_p(β) and E_f = Var_p(φ), and for the summed displacement β + φ the quadratic form decomposes as Σ_i δ_i²/p_i = E_b + E_f + 2C_bf + O(||β + φ||³), where C_bf = Cov_p(β, φ) = Σ_i p_i (β_i − β̄)(φ_i − φ̄) is the cross term. This decomposition, not the unweighted Σg_i²/p_i, is the correct probability-scale reading of the log-space factor model.</w:t>
+      </w:r>
+    </w:p>
+    <w:p>
+      <w:r>
+        <w:rPr>
+          <w:rFonts w:ascii="Arial" w:hAnsi="Arial"/>
+          <w:b w:val="0"/>
+          <w:color w:val="000000"/>
+          <w:sz w:val="22"/>
+        </w:rPr>
         <w:t>Lemma 2 (second-order expansion of JS with explicit remainder). For probability vectors p and q = p + δ on a panel, coordinate-separability of the Shannon entropy gives, by a third-order Taylor expansion of JS(p, q) = H((p + q)/2) − (H(p) + H(q))/2 (base-2): JS(p, q) = (1/(8 ln 2)) Σ_i δ_i²/p_i + R, with exact Lagrange remainder |R| ≤ (5/(48 ln 2)) Σ_i |δ_i|³/(p_i − |δ_i|)_+². The linear term vanishes pointwise, so no Σδ = 0 assumption is needed. Diagnostic (2,937 real pairs): the median relative error |JS − Q|/JS of the quadratic form Q was 0.23% on the HK panel under split-half nulls (brain and Tabula Sapiens) and 2.5–4.0% on observed cross-region/cross-organ pairs (90th percentile ≤ 9.7%); on the pair-specific top-200 panel the error was 1.1–2.1% under nulls but 10–18% on observed pairs (90th percentile up to 103% in brain), where per-gene relative displacements exceed 1. The expansion is therefore quantitative at the k_n scale and approximate at the k_f scale; statements below inherit this scoping (condition C1).</w:t>
       </w:r>
     </w:p>
@@ -2692,7 +2703,7 @@
           <w:color w:val="000000"/>
           <w:sz w:val="22"/>
         </w:rPr>
-        <w:t>Conditions. C1 (quadratic regime): per-gene relative displacement |δ_i|/p_i is small, so |R| is negligible against Q—verified above for k_n, approximate for k_f. C2 (stable selection inflation): the pair-specific top-200 selection inflates the per-gene background energy e_i = δ_i²/p_i by a roughly pair-independent factor α: on split-half null pairs the ratio of mean per-gene energy (top-200 versus HK panel) had median 14 (brain; 10–90% 10.3–22.1) and 8.5 (Tabula Sapiens; 7.0–14.5)—an order-statistic (winner’s-curse) effect of selecting the largest |difference| genes, of the same order as the empirical split-half baselines 6.67–9.73 (Supplementary Note 3). The residual gap (median 14 in brain versus the 9.73 brain baseline, which sits near the 10th percentile of the α distribution) is directionally expected: α is a per-gene energy ratio, whereas the baseline additionally folds in panel-size and composition differences between the 200-gene and ~1,130-gene sets and the k_f-scale expansion error diagnosed above, so the calibration constant admits a theoretical reading only up to these factors. C3 (stable functional panel): the pair-specific panel is not noise-driven beyond C2; quantified by the leave-pair-out ablation (Supplementary Note 9). C4 (adequate count depth): multinomial sampling contributes (d − 1)/(4N ln 2) to JS, below the background energy at the pseudobulk depths used here (Supplementary Note 16; notebooks/84).</w:t>
+        <w:t>Conditions. C1 (quadratic regime): per-gene relative displacement |δ_i|/p_i is small, so |R| is negligible against Q—verified above for k_n, approximate for k_f. C2 (stable selection inflation): α is a panel conversion factor for background energy, α = E_b(top-200)/E_b(HK)—the factor by which pair-specific top-200 selection inflates total background displacement energy relative to the HK panel; it multiplies E_b only, because selection operates on background magnitudes. Estimated on split-half null pairs (where E_f = 0 by construction) as the ratio of mean per-gene background energy (top-200 versus HK panel), α had median 14 (brain; 10–90% 10.3–22.1) and 8.5 (Tabula Sapiens; 7.0–14.5)—an order-statistic (winner’s-curse) effect of selecting the largest |difference| genes, of the same order as the empirical split-half baselines 6.67–9.73 (Supplementary Note 3). The residual gap (median 14 in brain versus the 9.73 brain baseline, which sits near the 10th percentile of the α distribution) is directionally expected: α is a per-gene energy ratio, whereas the baseline additionally folds in panel-size and composition differences between the 200-gene and ~1,130-gene sets and the k_f-scale expansion error diagnosed above, so the calibration constant admits a theoretical reading only up to these factors. C3 (stable functional panel): the pair-specific panel is not noise-driven beyond C2; quantified by the leave-pair-out ablation (Supplementary Note 9). C4 (adequate count depth): multinomial sampling contributes (d − 1)/(4N ln 2) to JS, below the background energy at the pseudobulk depths used here (Supplementary Note 16; notebooks/84). C5 (uncorrelated factors): the background and functional factors are uncorrelated under the p-weighted measure, C_bf = Cov_p(β, φ) = 0, so the cross term of Lemma 1b vanishes. Unlike C1–C4 this is an exclusion-style modeling assumption—the two factors are not separately observable on real pairs—so every statement below that invokes C5 is stated together with its worst-case relaxation: by Cauchy–Schwarz |2C_bf| ≤ 2√(E_b E_f), hence if C5 fails ω is biased by at most 2C_bf/E_b, bounded by 2√(E_f/E_b), which is small exactly when the functional signal dominates the background.</w:t>
       </w:r>
     </w:p>
     <w:p>
@@ -2703,7 +2714,7 @@
           <w:color w:val="000000"/>
           <w:sz w:val="22"/>
         </w:rPr>
-        <w:t>Proposition 3 (estimand). Under C1–C4 and the generative model, k_n ≈ (1/(8 ln 2)) E_b and k_f ≈ (1/(8 ln 2)) (E_f + αE_b), where E_b = Σ_i β_i²/p_i is the background displacement energy and E_f = Σ_i φ_i²/p_i the functional displacement energy on the panel. Hence ω = α + E_f/E_b + ε, with |ε| bounded by the Lemma-2 remainders, the C4 sampling term, and the pair-to-pair spread of α (C2)—the dominant term, which is exactly why absolute ω is dataset-relative. In words: ω measures the ratio of functional to background displacement energy on the probability simplex, shifted by the selection constant α that the split-half baseline estimates; the calibrated statistic satisfies ω_cal − 1 ≈ E_f/(αE_b). Within the model class this is the quantity ω corresponds to—an approximation conditional on the post-selection panel (the pair-specific top-200 set is itself data-selected, so E_f and α are defined relative to that selection rather than to a fixed gene set) and quantitative only at the k_n scale under C1.</w:t>
+        <w:t>Proposition 3 (estimand). Under C1–C4 and the generative model, k_n ≈ (1/(8 ln 2)) E_b on the HK panel, while on the pair-specific panel k_f ≈ (1/(8 ln 2)) (E_f + 2C_bf + αE_b), with E_b, E_f, and C_bf as defined in Lemma 1b (the p-weighted (co)variances of the log-factors, not the unweighted Σg_i²/p_i). The cross term 2C_bf is intrinsic to the quadratic form of the summed displacement β + φ and cannot be dropped without a condition. Under C5 it vanishes and ω = α + E_f/E_b + ε, with |ε| bounded by the Lemma-2 remainders, the C4 sampling term, and the pair-to-pair spread of α (C2)—the dominant term, which is exactly why absolute ω is dataset-relative. Without C5 the estimand is ω = α + (E_f + 2C_bf)/E_b + ε: functional and background energy no longer separate, and ω picks up 2C_bf/E_b, bounded in magnitude by 2√(E_f/E_b) (Cauchy–Schwarz). In words: ω measures the ratio of functional to background displacement energy on the probability simplex—up to the cross term, which C5 excludes and the bound quantifies—shifted by the selection constant α that the split-half baseline estimates; the calibrated statistic satisfies ω_cal − 1 ≈ E_f/(αE_b) under C5. Within the model class this is the quantity ω corresponds to—an approximation conditional on the post-selection panel (the pair-specific top-200 set is itself data-selected, so E_f and α are defined relative to that selection rather than to a fixed gene set) and quantitative only at the k_n scale under C1.</w:t>
       </w:r>
     </w:p>
     <w:p>
@@ -2714,7 +2725,7 @@
           <w:color w:val="000000"/>
           <w:sz w:val="22"/>
         </w:rPr>
-        <w:t>Proposition 4 (local monotonicity, global saturation). Wherever C1 holds, strengthening the functional factor (φ → λφ, λ &gt; 1) with background fixed scales E_f → λ²E_f and leaves E_b unchanged, so ∂ω/∂E_f = 1/E_b &gt; 0: ω increases strictly with functional change, independently of α. Globally this cannot persist—JS is bounded by 1 bit—so the mapping is local. Ground-truth check (factorial grid of Supplementary Note 1): at zero background drift ω rose monotonically with the injected shift δ (Spearman ρ = 0.688, P = 5.1 × 10⁻¹⁶²; grid means 10.2 → 27.2 over δ = 0–2, baseline offset ≈ α as predicted) while k_n stayed flat (ρ = 0.004); under pure HK-anchored drift (δ = 0) ω declined (ρ = −0.821, driven by the k_n denominator, ρ = +0.888)—background drift moves ω downward, never upward, matching the drift-rejection specificity of Supplementary Notes 1 and 6.</w:t>
+        <w:t>Identification (how β and φ are separated). The observed displacement identifies only the sum β + φ; writing down the factor model log x = σ + β + φ does not by itself determine the two factors. Separation requires one exclusion restriction and three measurements. A1 (exclusion restriction): the functional factor vanishes on housekeeping genes, φ = 0 on the HK panel—HK genes are pre-specified for stable expression across conditions (Methods), so condition-driven regulatory change is excluded from that panel by construction. Under A1: (i) k_n on the HK panel identifies E_b (Proposition 3); (ii) split-half null pairs, on which E_f = 0 by construction, identify α = E_b(top-200)/E_b(HK) (C2); (iii) on an observed pair, k_f identifies E_f + 2C_bf + αE_b, and subtracting αk_n identifies E_f + 2C_bf—equal to E_f under C5. Three unknowns (E_b, α, E_f) meet three measurements in a linear system with a unique solution, so the decomposition is identified, not merely defined. The two restrictions play different roles: without A1 no calibration can separate E_f from αE_b using (k_f, k_n) alone; without C5 the identified functional quantity is E_f + 2C_bf, with the Cauchy–Schwarz bound above. The post-selection caveat of Proposition 3 applies throughout: E_f and α are defined relative to the data-selected panel.</w:t>
       </w:r>
     </w:p>
     <w:p>
@@ -2725,6 +2736,17 @@
           <w:color w:val="000000"/>
           <w:sz w:val="22"/>
         </w:rPr>
+        <w:t>Proposition 4 (conditional monotonicity; local strict increase; global saturation). Three statements that are easily conflated must be separated. (a) Approximate layer: in the quadratic form, strengthening the functional factor (φ → λφ, λ &gt; 1) with background fixed gives ω(λ) = α + (λ²E_f + 2λC_bf)/E_b, so ∂ω/∂λ = 2(λE_f + C_bf)/E_b. Under C5 this is strictly positive for all λ &gt; 0: the approximate estimand increases strictly with functional change. Without C5 the same conclusion holds if and only if λE_f + C_bf &gt; 0; by Cauchy–Schwarz it is guaranteed once λ²E_f &gt; E_b (functional energy exceeds background energy) and can fail for weak functional signals under adversarial negative covariance—“stronger functional change implies larger ω” is a conditional statement, not a universal one: the cross term scales as λ, not λ², so no α-independent monotonicity exists outside C5. (b) Raw-JS layer: JS(p, q(λ)) is smooth in λ, and by Lemma 2 its derivative equals that of the quadratic form plus a remainder derivative of order O(Σ_i (|δ_i|/p_i)² |dδ_i/dλ|), small wherever C1 holds; the sign of ∂ω/∂λ is therefore inherited by the raw ratio in a neighborhood of the observed λ (local strict monotonicity under the same condition), not asserted globally from the expansion alone. (c) Global layer: JS is bounded by 1 bit, so no global monotonicity can hold; claims are restricted to the operating regime diagnosed in Lemma 2 and confirmed on ground truth. Ground-truth check (factorial grid of Supplementary Note 1): at zero background drift ω rose monotonically with the injected shift δ (Spearman ρ = 0.688, P = 5.1 × 10⁻¹⁶²; grid means 10.2 → 27.2 over δ = 0–2, baseline offset ≈ α as predicted) while k_n stayed flat (ρ = 0.004); under pure HK-anchored drift (δ = 0) ω declined (ρ = −0.821, driven by the k_n denominator, ρ = +0.888)—background drift moves ω downward, never upward, matching the drift-rejection specificity of Supplementary Notes 1 and 6.</w:t>
+      </w:r>
+    </w:p>
+    <w:p>
+      <w:r>
+        <w:rPr>
+          <w:rFonts w:ascii="Arial" w:hAnsi="Arial"/>
+          <w:b w:val="0"/>
+          <w:color w:val="000000"/>
+          <w:sz w:val="22"/>
+        </w:rPr>
         <w:t>Proposition 5 (calibration bias, delta method). The ratio estimator inherits second-order bias E[ω] ≈ (μ_f/μ_n)(1 + CV_n² − ρ CV_f CV_n). From the split-half products (Supplementary Note 3): CV_n = 0.056 (brain) / 0.091 (mouse), CV_f = 0.096 / 0.240, ρ(k_f, k_n) = 0.92 / 0.73, giving relative bias −0.18% (brain) and −0.76% (mouse)—negligible against reported effects, and dominated by the between-population spread of the calibration denominator that the joint bootstrap propagates (Supplementary Note 3). These class-level predictions reconcile with the pooled empirical estimate of Supplementary Note 4 (median +0.2% across groups, pooled −1.8%): the pooled figure aggregates all 1,450 replicates including the smallest-denominator groups (bias up to +6.5%), whereas the delta-method inputs above are class-level means; the two aggregations bracket the same small effect.</w:t>
       </w:r>
     </w:p>
@@ -2736,7 +2758,7 @@
           <w:color w:val="000000"/>
           <w:sz w:val="22"/>
         </w:rPr>
-        <w:t>What the HK denominator adds beyond k_f with a correct null. (i) Identifiability: k_f alone estimates the sum E_f + αE_b; functional and background energy cannot be separated from k_f by any calibration that does not measure E_b independently—the HK panel supplies that measurement, making E_f/E_b identifiable. (ii) Studentization: a valid per-pair null for k_f must condition on the pair’s own background magnitude, which is unobservable; dividing by k_n yields a statistic whose null is approximately ancillary to it—the same logic by which dividing by the sample standard deviation turns a mean difference into a t-statistic. Empirically, the cross-class dispersion of the split-half null collapses under studentization: across the 10 brain classes the coefficient of variation of the class-level null median falls from 1.21 (k_f) to 0.148 (ω), and the max/min ratio from 195 to 1.63; across mouse tissue-cell-type populations from 0.436 to 0.251 (max/min 3.87 to 2.06)—the ω null is up to eightfold more portable across classes, which is what licenses a single global calibration. (iii) Measured error rates: the measurable gain of the denominator is against anchor-free global metrics—under injected compositional drift, raw JS and cosine false-positive rates reach 0.55–1.00 versus 0.000–0.067 for ω (Supplementary Notes 1, 6)—whereas k_f-only is itself specific under the same drift (0.007–0.020), so false-positive rates alone do not separate ω from a k_f-only analysis; under a composition-preserving gene-identity swap, ω and all comparators fire at 1.00 (Supplementary Note 6, N2). The error-rate argument thus supports the ratio structure against anchor-free baselines, and the TCGA reversal is a k_n phenomenon invisible to any k_f-only analysis (Supplementary Note 10).</w:t>
+        <w:t>What the HK denominator adds beyond k_f with a correct null. (i) Identifiability: this is the three-measurement argument above in operational form—k_f alone estimates the sum E_f + 2C_bf + αE_b; functional and background energy cannot be separated from k_f by any calibration that does not measure E_b independently—the HK panel supplies that measurement (A1), making E_f/E_b identifiable under C5 (and E_f + 2C_bf identifiable without it). (ii) Studentization: a valid per-pair null for k_f must condition on the pair’s own background magnitude, which is unobservable; dividing by k_n yields a statistic whose null is approximately ancillary to it—the same logic by which dividing by the sample standard deviation turns a mean difference into a t-statistic. Empirically, the cross-class dispersion of the split-half null collapses under studentization: across the 10 brain classes the coefficient of variation of the class-level null median falls from 1.21 (k_f) to 0.148 (ω), and the max/min ratio from 195 to 1.63; across mouse tissue-cell-type populations from 0.436 to 0.251 (max/min 3.87 to 2.06)—the ω null is up to eightfold more portable across classes, which is what licenses a single global calibration. (iii) Measured error rates: the measurable gain of the denominator is against anchor-free global metrics—under injected compositional drift, raw JS and cosine false-positive rates reach 0.55–1.00 versus 0.000–0.067 for ω (Supplementary Notes 1, 6)—whereas k_f-only is itself specific under the same drift (0.007–0.020), so false-positive rates alone do not separate ω from a k_f-only analysis; under a composition-preserving gene-identity swap, ω and all comparators fire at 1.00 (Supplementary Note 6, N2). The error-rate argument thus supports the ratio structure against anchor-free baselines, and the TCGA reversal is a k_n phenomenon invisible to any k_f-only analysis (Supplementary Note 10).</w:t>
       </w:r>
     </w:p>
     <w:p>
@@ -2747,7 +2769,7 @@
           <w:color w:val="000000"/>
           <w:sz w:val="22"/>
         </w:rPr>
-        <w:t>Scope. Lemma 1 is exact for the stated normalization; Lemma 2 is exact mathematics with an explicit remainder; Propositions 3–5 are model-relative and conditional on C1–C4, each checked on real data above or in the referenced notes. Where a condition holds only approximately (C1 at the k_f scale; C2 as a stable-but-variable α), the corresponding statements are approximations, and the main-text claims relying on them are phrased accordingly.</w:t>
+        <w:t>Scope. Lemma 1 is exact for the stated normalization; Lemma 2 is exact mathematics with an explicit remainder; Propositions 3–5 are model-relative and conditional on C1–C5, each checked on real data above or in the referenced notes. Where a condition holds only approximately (C1 at the k_f scale; C2 as a stable-but-variable α), the corresponding statements are approximations, and the main-text claims relying on them are phrased accordingly. C5 differs in kind: it is an exclusion-style assumption, not an approximation, and is not separately verifiable on observed pairs; statements invoking it (Propositions 3–4) therefore carry the explicit Cauchy–Schwarz worst-case bias 2√(E_f/E_b), and the main-text monotonicity claim is phrased as conditional accordingly.</w:t>
       </w:r>
     </w:p>
     <w:p>
@@ -3354,7 +3376,7 @@
           <w:color w:val="000000"/>
           <w:sz w:val="22"/>
         </w:rPr>
-        <w:t>Supplementary Fig. 2. Theory diagnostics for the scoped framework (Supplementary Note 20; notebooks/85_theory_diagnostics.py; results/theory_diagnostics.csv). (a) Second-order expansion error |JS − Q| / JS (log scale) for the HK panel (steel; k_n scale) and the pair-specific top-200 panel (purple; k_f scale) across 2,937 real pairs: brain cross-region observed (n = 1,500), brain within-region split-half nulls (n = 900), Tabula Sapiens cross-organ observed (n = 37) and split-half nulls (n = 500); boxes = IQR, whiskers = 1.5 × IQR, outliers suppressed. The expansion is quantitative at the k_n scale (median error 0.23% under nulls, 2.5–4.0% observed) and approximate at the k_f scale (10–18% observed). (b) Background-energy exchangeability under split-half nulls: distribution of the per-gene mean-energy ratio (top-200 versus HK panel), median 14 (brain) and 8.5 (Tabula Sapiens)—the order-statistic selection inflation α estimated by the split-half baseline (6.67–9.73). (c) Ground-truth estimand: mean ω − 1 (log scale) versus the injected functional shift δ at each background-drift level η (factorial grid, ε = 0; Supplementary Note 1); ω − 1 rises monotonically with δ from the selection-inflated baseline offset and collapses toward 0 under strong HK-anchored drift. (d) Null ancillarity: cross-class coefficient of variation of the split-half null median for k_f, k_n and ω (10 brain classes; 38 mouse tissue–cell-type populations)—studentization by the HK denominator contracts the null dispersion up to eightfold (brain CV 1.21 → 0.148).</w:t>
+        <w:t>Supplementary Fig. 2. Theory diagnostics for the scoped framework (Supplementary Note 20; notebooks/85_theory_diagnostics.py; results/theory_diagnostics.csv). (a) Second-order expansion error |JS − Q| / JS (log scale) for the HK panel (steel; k_n scale) and the pair-specific top-200 panel (purple; k_f scale) across 2,937 real pairs: brain cross-region observed (n = 1,500), brain within-region split-half nulls (n = 900), Tabula Sapiens cross-organ observed (n = 37) and split-half nulls (n = 500); boxes = IQR, whiskers = 1.5 × IQR, outliers suppressed. The expansion is quantitative at the k_n scale (median error 0.23% under nulls, 2.5–4.0% observed) and approximate at the k_f scale (10–18% observed). (b) Background-energy exchangeability under split-half nulls: distribution of the per-gene mean-energy ratio (top-200 versus HK panel), median 14 (brain) and 8.5 (Tabula Sapiens)—the order-statistic selection inflation α estimated by the split-half baseline (6.67–9.73). (c) Ground-truth estimand: mean ω − 1 (log scale) versus the injected functional shift δ at each background-drift level η (factorial grid, ε = 0, background and functional shifts injected independently so that C_bf = 0 by construction; Supplementary Note 1); ω − 1 rises monotonically with δ from the selection-inflated baseline offset and collapses toward 0 under strong HK-anchored drift. (d) Null ancillarity: cross-class coefficient of variation of the split-half null median for k_f, k_n and ω (10 brain classes; 38 mouse tissue–cell-type populations)—studentization by the HK denominator contracts the null dispersion up to eightfold (brain CV 1.21 → 0.148).</w:t>
       </w:r>
     </w:p>
     <w:p>

</xml_diff>

<commit_message>
nc77: correct Cauchy-Schwarz cross-term bound to 2*sqrt(alpha*E_f/E_b) (Lemma 1b evaluates E_b on the HK panel but C_bf/E_f on the top-200 panel, so C-S carries sqrt(alpha)); fix Prop 4(a) guarantee condition to lambda^2 E_f > alpha E_b; rerun IFN-beta quant (5/6 inside band, only CD14+ breaches)
</commit_message>
<xml_diff>
--- a/CKI_Submission_NC/CKI_Supplementary_NC.docx
+++ b/CKI_Submission_NC/CKI_Supplementary_NC.docx
@@ -2201,7 +2201,7 @@
           <w:color w:val="000000"/>
           <w:sz w:val="22"/>
         </w:rPr>
-        <w:t>Quantitative A1 anatomy (notebooks/nc76_ifnb_theory_quant.py). In the notation of Supplementary Note 20, per cell type: E_b (median k_n of donor-versus-donor control pairs) is 0.0022-0.0079; the A1 violation φ_HK = median k_n(stimulated−control) − E_b ranges from 0.12 E_b (CD8 T cells) to 4.76 E_b (CD14+ monocytes), i.e. a multiplicative ω deflation of φ/(E_b+φ) = 10-83%. With α estimated from split-half pairs (8.1-18.9), the estimand α + (E_f + 2C_bf)/E_b and the observed ω give a signed bias that stays inside the 2√(E_f/E_b) Cauchy–Schwarz band in four of six cell types (B cells −9.2 versus 10.1; CD4 −2.1 versus 7.9; CD8 −1.5 versus 7.6; NK −2.5 versus 7.8) but breaches it precisely in the two anchor-affected monocytic types (CD14+ −78.0 versus 19.4; FCGR3A+ −28.0 versus 13.5). This is the expected behaviour: the 2√(E_f/E_b) bound covers only the numerator cross-term C_bf, whereas A1 failure multiplies the denominator by (1 + φ/E_b) and deflates ω without bound—which is why a marked k_n rise, not the ω value itself, is the operative alarm that A1 has failed, and why k_f-only is the recommended statistic in that regime (Supplementary Note 20, Identification).</w:t>
+        <w:t>Quantitative A1 anatomy (notebooks/nc76_ifnb_theory_quant.py). In the notation of Supplementary Note 20, per cell type: E_b (median k_n of donor-versus-donor control pairs) is 0.0022-0.0079; the A1 violation φ_HK = median k_n(stimulated−control) − E_b ranges from 0.12 E_b (CD8 T cells) to 4.76 E_b (CD14+ monocytes), i.e. a multiplicative ω deflation of φ/(E_b+φ) = 10-83%. With α estimated from split-half pairs (8.1-18.9), the estimand α + (E_f + 2C_bf)/E_b and the observed ω give a signed bias. The Cauchy–Schwarz band carries √α, because C_bf and E_f are evaluated on the pair-specific panel where the background energy is αE_b while E_b itself is measured on the HK panel (Supplementary Note 20): the correct band is 2√(αE_f/E_b), √α ≈ 2.8–4.3 here, not 2√(E_f/E_b). Against that band the bias stays inside in five of six cell types (B cells −9.2 versus 30.5; CD4 −2.1 versus 34.2; CD8 −1.5 versus 24.3; FCGR3A+ −28.0 versus 41.2; NK −2.5 versus 22.1) but breaches it in the most anchor-affected type (CD14+ −78.0 versus 67.4, φ/E_b = 4.76). This is the expected behaviour: the band covers only the numerator cross-term C_bf, whereas A1 failure multiplies the denominator by (1 + φ/E_b) and deflates ω without bound—which is why a marked k_n rise, not the ω value itself, is the operative alarm that A1 has failed, and why k_f-only is the recommended statistic in that regime (Supplementary Note 20, Identification).</w:t>
       </w:r>
     </w:p>
     <w:p>
@@ -2791,7 +2791,7 @@
           <w:color w:val="000000"/>
           <w:sz w:val="22"/>
         </w:rPr>
-        <w:t>Conditions. C1 (quadratic regime): per-gene relative displacement |δ_i|/p_i is small, so |R| is negligible against Q—verified above for k_n, approximate for k_f. C2 (stable selection inflation): α is a panel conversion factor for background energy, α = E_b(top-200)/E_b(HK)—the factor by which pair-specific top-200 selection inflates total background displacement energy relative to the HK panel; it multiplies E_b only, because selection operates on background magnitudes. Estimated on split-half null pairs (where E_f = 0 by construction) as the ratio of mean per-gene background energy (top-200 versus HK panel), α had median 14 (brain; 10–90% 10.3–22.1) and 8.5 (Tabula Sapiens; 7.0–14.5)—an order-statistic (winner’s-curse) effect of selecting the largest |difference| genes, of the same order as the empirical split-half baselines 6.67–9.73 (Supplementary Note 3). The residual gap (median 14 in brain versus the 9.73 brain baseline, which sits near the 10th percentile of the α distribution) is directionally expected: α is a per-gene energy ratio, whereas the baseline additionally folds in panel-size and composition differences between the 200-gene and ~1,130-gene sets and the k_f-scale expansion error diagnosed above, so the calibration constant admits a theoretical reading only up to these factors. Operationally the theoretical α is used only for the qualitative structure of the estimand; absolute calibration always uses the empirical split-half baselines (9.73 brain, 7.70 mouse), so the ≈ 1.4-fold gap between the two readings does not propagate into any reported statistic. C3 (stable functional panel): the pair-specific panel is not noise-driven beyond C2; quantified by the leave-pair-out ablation (Supplementary Note 9). C4 (adequate count depth): multinomial sampling contributes (d − 1)/(4N ln 2) to JS, below the background energy at the pseudobulk depths used here (Supplementary Note 16; notebooks/84). C5 (uncorrelated factors): the background and functional factors are uncorrelated under the p-weighted measure, C_bf = Cov_p(β, φ) = 0, so the cross term of Lemma 1b vanishes. Unlike C1–C4 this is an exclusion-style modeling assumption—the two factors are not separately observable on real pairs—so every statement below that invokes C5 is stated together with its worst-case relaxation: by Cauchy–Schwarz |2C_bf| ≤ 2√(E_b E_f), hence if C5 fails ω is biased by at most 2C_bf/E_b, bounded by 2√(E_f/E_b), which is small exactly when the functional signal dominates the background.</w:t>
+        <w:t>Conditions. C1 (quadratic regime): per-gene relative displacement |δ_i|/p_i is small, so |R| is negligible against Q—verified above for k_n, approximate for k_f. C2 (stable selection inflation): α is a panel conversion factor for background energy, α = E_b(top-200)/E_b(HK)—the factor by which pair-specific top-200 selection inflates total background displacement energy relative to the HK panel; it multiplies E_b only, because selection operates on background magnitudes. Estimated on split-half null pairs (where E_f = 0 by construction) as the ratio of mean per-gene background energy (top-200 versus HK panel), α had median 14 (brain; 10–90% 10.3–22.1) and 8.5 (Tabula Sapiens; 7.0–14.5)—an order-statistic (winner’s-curse) effect of selecting the largest |difference| genes, of the same order as the empirical split-half baselines 6.67–9.73 (Supplementary Note 3). The residual gap (median 14 in brain versus the 9.73 brain baseline, which sits near the 10th percentile of the α distribution) is directionally expected: α is a per-gene energy ratio, whereas the baseline additionally folds in panel-size and composition differences between the 200-gene and ~1,130-gene sets and the k_f-scale expansion error diagnosed above, so the calibration constant admits a theoretical reading only up to these factors. Operationally the theoretical α is used only for the qualitative structure of the estimand; absolute calibration always uses the empirical split-half baselines (9.73 brain, 7.70 mouse), so the ≈ 1.4-fold gap between the two readings does not propagate into any reported statistic. C3 (stable functional panel): the pair-specific panel is not noise-driven beyond C2; quantified by the leave-pair-out ablation (Supplementary Note 9). C4 (adequate count depth): multinomial sampling contributes (d − 1)/(4N ln 2) to JS, below the background energy at the pseudobulk depths used here (Supplementary Note 16; notebooks/84). C5 (uncorrelated factors): the background and functional factors are uncorrelated under the p-weighted measure, C_bf = Cov_p(β, φ) = 0, so the cross term of Lemma 1b vanishes. Unlike C1–C4 this is an exclusion-style modeling assumption—the two factors are not separately observable on real pairs—so every statement below that invokes C5 is stated together with its worst-case relaxation: because E_b is measured on the HK panel while C_bf and E_f live on the pair-specific panel, Cauchy–Schwarz applies in the top-200 inner product, where the background energy is αE_b, so |2C_bf| ≤ 2√(αE_b E_f): if C5 fails, ω is biased by 2C_bf/E_b, bounded in magnitude by 2√(αE_f/E_b). The √α factor is not optional—writing 2√(E_f/E_b) mixes the two measures and understates the bound by √α (≈ 2.9 and 3.7 for the Tabula Sapiens and brain α medians)—and the bound is small exactly when the functional signal dominates the background energy on that panel.</w:t>
       </w:r>
     </w:p>
     <w:p>
@@ -2802,7 +2802,7 @@
           <w:color w:val="000000"/>
           <w:sz w:val="22"/>
         </w:rPr>
-        <w:t>Proposition 3 (estimand). Under C1–C4 and the generative model, k_n ≈ (1/(8 ln 2)) E_b on the HK panel, while on the pair-specific panel k_f ≈ (1/(8 ln 2)) (E_f + 2C_bf + αE_b), with E_b, E_f, and C_bf as defined in Lemma 1b (the p-weighted (co)variances of the log-factors, not the unweighted Σg_i²/p_i). The cross term 2C_bf is intrinsic to the quadratic form of the summed displacement β + φ and cannot be dropped without a condition. Under C5 it vanishes and ω = α + E_f/E_b + ε, with |ε| bounded by the Lemma-2 remainders, the C4 sampling term, and the pair-to-pair spread of α (C2)—the dominant term, which is exactly why absolute ω is dataset-relative. Without C5 the estimand is ω = α + (E_f + 2C_bf)/E_b + ε: functional and background energy no longer separate, and ω picks up 2C_bf/E_b, bounded in magnitude by 2√(E_f/E_b) (Cauchy–Schwarz). In words: ω measures the ratio of functional to background displacement energy on the probability simplex—up to the cross term, which C5 excludes and the bound quantifies—shifted by the selection constant α that the split-half baseline estimates; the calibrated statistic satisfies ω_cal − 1 ≈ E_f/(αE_b) under C5. Within the model class this is the quantity ω corresponds to—an approximation conditional on the post-selection panel (the pair-specific top-200 set is itself data-selected, so E_f and α are defined relative to that selection rather than to a fixed gene set) and quantitative only at the k_n scale under C1.</w:t>
+        <w:t>Proposition 3 (estimand). Under C1–C4 and the generative model, k_n ≈ (1/(8 ln 2)) E_b on the HK panel, while on the pair-specific panel k_f ≈ (1/(8 ln 2)) (E_f + 2C_bf + αE_b), with E_b, E_f, and C_bf as defined in Lemma 1b (the p-weighted (co)variances of the log-factors, not the unweighted Σg_i²/p_i). The cross term 2C_bf is intrinsic to the quadratic form of the summed displacement β + φ and cannot be dropped without a condition. Under C5 it vanishes and ω = α + E_f/E_b + ε, with |ε| bounded by the Lemma-2 remainders, the C4 sampling term, and the pair-to-pair spread of α (C2)—the dominant term, which is exactly why absolute ω is dataset-relative. Without C5 the estimand is ω = α + (E_f + 2C_bf)/E_b + ε: functional and background energy no longer separate, and ω picks up 2C_bf/E_b, bounded in magnitude by 2√(αE_f/E_b) (Cauchy–Schwarz in the top-200 inner product, where the background energy is αE_b). In words: ω measures the ratio of functional to background displacement energy on the probability simplex—up to the cross term, which C5 excludes and the bound quantifies—shifted by the selection constant α that the split-half baseline estimates; the calibrated statistic satisfies ω_cal − 1 ≈ E_f/(αE_b) under C5. Within the model class this is the quantity ω corresponds to—an approximation conditional on the post-selection panel (the pair-specific top-200 set is itself data-selected, so E_f and α are defined relative to that selection rather than to a fixed gene set) and quantitative only at the k_n scale under C1.</w:t>
       </w:r>
     </w:p>
     <w:p>
@@ -2824,7 +2824,7 @@
           <w:color w:val="000000"/>
           <w:sz w:val="22"/>
         </w:rPr>
-        <w:t>Proposition 4 (conditional monotonicity; local strict increase; global saturation). Three statements that are easily conflated must be separated. (a) Approximate layer: in the quadratic form, strengthening the functional factor (φ → λφ, λ &gt; 1) with background fixed gives ω(λ) = α + (λ²E_f + 2λC_bf)/E_b (with α held fixed; strengthening φ can shift the top-200 panel and hence α, per the post-selection caveat of Proposition 3), so ∂ω/∂λ = 2(λE_f + C_bf)/E_b. Under C5 this is strictly positive for all λ &gt; 0: the approximate estimand increases strictly with functional change. Without C5 the same conclusion holds if and only if λE_f + C_bf &gt; 0; by Cauchy–Schwarz it is guaranteed once λ²E_f &gt; E_b (functional energy exceeds background energy) and can fail for weak functional signals under adversarial negative covariance—“stronger functional change implies larger ω” is a conditional statement, not a universal one: the cross term scales as λ, not λ², so no α-independent monotonicity exists outside C5. (b) Raw-JS layer: JS(p, q(λ)) is smooth in λ, and by Lemma 2 its derivative equals that of the quadratic form plus a remainder derivative of order O(Σ_i (|δ_i|/p_i)² |dδ_i/dλ|). At the k_n scale, where C1 is verified, the remainder is negligible and the sign of ∂ω/∂λ is inherited by the raw ratio in a neighborhood of the observed λ. At the k_f scale, where the Lemma-2 diagnostic reaches 103% at the 90th percentile, no such quantitative bound survives: the statement is qualitative there, and its empirical support is the ground-truth grid below rather than the expansion. (c) Global layer: JS is bounded by 1 bit, so no global monotonicity can hold; claims are restricted to the operating regime diagnosed in Lemma 2 and confirmed on ground truth. Ground-truth check (factorial grid of Supplementary Note 1, constructed with C_bf = 0 and therefore covering the C5 branch only): at zero background drift ω rose monotonically with the injected shift δ (Spearman ρ = 0.688, P = 5.1 × 10⁻¹⁶²; grid means 10.2 → 27.2 over δ = 0–2, baseline offset ≈ α as predicted) while k_n stayed flat (ρ = 0.004); under pure HK-anchored drift (δ = 0) ω declined (ρ = −0.821, driven by the k_n denominator, ρ = +0.888)—background drift moves ω downward, never upward, matching the drift-rejection specificity of Supplementary Notes 1 and 6.</w:t>
+        <w:t>Proposition 4 (conditional monotonicity; local strict increase; global saturation). Three statements that are easily conflated must be separated. (a) Approximate layer: in the quadratic form, strengthening the functional factor (φ → λφ, λ &gt; 1) with background fixed gives ω(λ) = α + (λ²E_f + 2λC_bf)/E_b (with α held fixed; strengthening φ can shift the top-200 panel and hence α, per the post-selection caveat of Proposition 3), so ∂ω/∂λ = 2(λE_f + C_bf)/E_b. Under C5 this is strictly positive for all λ &gt; 0: the approximate estimand increases strictly with functional change. Without C5 the same conclusion holds if and only if λE_f + C_bf &gt; 0; by Cauchy–Schwarz it is guaranteed once λ²E_f &gt; αE_b (functional energy exceeds the background energy measured on the same, pair-specific panel; the α appears for the same measure-matching reason as in the Proposition 3 bound) and can fail for weak functional signals under adversarial negative covariance—“stronger functional change implies larger ω” is a conditional statement, not a universal one: the cross term scales as λ, not λ², so no α-independent monotonicity exists outside C5. (b) Raw-JS layer: JS(p, q(λ)) is smooth in λ, and by Lemma 2 its derivative equals that of the quadratic form plus a remainder derivative of order O(Σ_i (|δ_i|/p_i)² |dδ_i/dλ|). At the k_n scale, where C1 is verified, the remainder is negligible and the sign of ∂ω/∂λ is inherited by the raw ratio in a neighborhood of the observed λ. At the k_f scale, where the Lemma-2 diagnostic reaches 103% at the 90th percentile, no such quantitative bound survives: the statement is qualitative there, and its empirical support is the ground-truth grid below rather than the expansion. (c) Global layer: JS is bounded by 1 bit, so no global monotonicity can hold; claims are restricted to the operating regime diagnosed in Lemma 2 and confirmed on ground truth. Ground-truth check (factorial grid of Supplementary Note 1, constructed with C_bf = 0 and therefore covering the C5 branch only): at zero background drift ω rose monotonically with the injected shift δ (Spearman ρ = 0.688, P = 5.1 × 10⁻¹⁶²; grid means 10.2 → 27.2 over δ = 0–2, baseline offset ≈ α as predicted) while k_n stayed flat (ρ = 0.004); under pure HK-anchored drift (δ = 0) ω declined (ρ = −0.821, driven by the k_n denominator, ρ = +0.888)—background drift moves ω downward, never upward, matching the drift-rejection specificity of Supplementary Notes 1 and 6.</w:t>
       </w:r>
     </w:p>
     <w:p>
@@ -2857,7 +2857,7 @@
           <w:color w:val="000000"/>
           <w:sz w:val="22"/>
         </w:rPr>
-        <w:t>Scope. Lemma 1 is exact for the stated normalization; Lemma 2 is exact mathematics with an explicit remainder; Propositions 3–5 are model-relative and conditional on C1–C5, each checked on real data above or in the referenced notes. Where a condition holds only approximately (C1 at the k_f scale; C2 as a stable-but-variable α), the corresponding statements are approximations, and the main-text claims relying on them are phrased accordingly. C5 differs in kind: it is an exclusion-style assumption, not an approximation, and is not separately verifiable on observed pairs; statements invoking it (Propositions 3–4) therefore carry the explicit Cauchy–Schwarz worst-case bias 2√(E_f/E_b), and the main-text monotonicity claim is phrased as conditional accordingly.</w:t>
+        <w:t>Scope. Lemma 1 is exact for the stated normalization; Lemma 2 is exact mathematics with an explicit remainder; Propositions 3–5 are model-relative and conditional on C1–C5, each checked on real data above or in the referenced notes. Where a condition holds only approximately (C1 at the k_f scale; C2 as a stable-but-variable α), the corresponding statements are approximations, and the main-text claims relying on them are phrased accordingly. C5 differs in kind: it is an exclusion-style assumption, not an approximation, and is not separately verifiable on observed pairs; statements invoking it (Propositions 3–4) therefore carry the explicit Cauchy–Schwarz worst-case bias 2√(αE_f/E_b), and the main-text monotonicity claim is phrased as conditional accordingly.</w:t>
       </w:r>
     </w:p>
     <w:p>

</xml_diff>